<commit_message>
ai ml notes added
</commit_message>
<xml_diff>
--- a/ADS/theory/TREES/New Microsoft Word Document.docx
+++ b/ADS/theory/TREES/New Microsoft Word Document.docx
@@ -378,6 +378,7 @@
         </w:numPr>
       </w:pPr>
       <w:r>
+        <w:lastRenderedPageBreak/>
         <w:t>If the value is in a 2-node, it is replaced by its in-order successor, and the tree is restructured to maintain balance.</w:t>
       </w:r>
     </w:p>
@@ -739,6 +740,7 @@
         </w:numPr>
       </w:pPr>
       <w:r>
+        <w:lastRenderedPageBreak/>
         <w:t xml:space="preserve">Case 2 (Uncle is Black): If node is a right child, perform a left rotation on the parent. If the node is a left child, perform a right rotation on the grandparent and </w:t>
       </w:r>
       <w:proofErr w:type="spellStart"/>
@@ -1107,6 +1109,7 @@
           <w:b/>
           <w:bCs/>
         </w:rPr>
+        <w:lastRenderedPageBreak/>
         <w:t>Drawbacks Compared to Other Trees</w:t>
       </w:r>
       <w:r>
@@ -1455,6 +1458,7 @@
     </w:p>
     <w:p>
       <w:r>
+        <w:lastRenderedPageBreak/>
         <w:t>Each node has pointers to its child nodes. The number of child pointers is always one more than the number of keys in the node.</w:t>
       </w:r>
     </w:p>
@@ -1737,6 +1741,7 @@
         </w:numPr>
       </w:pPr>
       <w:r>
+        <w:lastRenderedPageBreak/>
         <w:t>If the key is found in an internal node, there are two cases:</w:t>
       </w:r>
     </w:p>
@@ -1880,6 +1885,376 @@
       </w:pPr>
       <w:r>
         <w:t>Compare the key with the keys in the current node to determine the correct child to search.</w:t>
+      </w:r>
+    </w:p>
+    <w:p>
+      <w:pPr>
+        <w:pStyle w:val="Heading1"/>
+      </w:pPr>
+      <w:hyperlink r:id="rId10" w:tgtFrame="_blank" w:history="1">
+        <w:r>
+          <w:rPr>
+            <w:rStyle w:val="Hyperlink"/>
+            <w:b/>
+            <w:bCs/>
+          </w:rPr>
+          <w:t>Binary Heap</w:t>
+        </w:r>
+      </w:hyperlink>
+    </w:p>
+    <w:p>
+      <w:r>
+        <w:t xml:space="preserve">A </w:t>
+      </w:r>
+      <w:r>
+        <w:rPr>
+          <w:b/>
+          <w:bCs/>
+        </w:rPr>
+        <w:t>binary heap</w:t>
+      </w:r>
+      <w:r>
+        <w:t xml:space="preserve"> is a complete binary tree that satisfies the heap property. It is commonly used to implement priority queues and is efficient for operations like insertion, deletion, and finding the minimum or maximum element.</w:t>
+      </w:r>
+    </w:p>
+    <w:p>
+      <w:pPr>
+        <w:rPr>
+          <w:b/>
+          <w:bCs/>
+        </w:rPr>
+      </w:pPr>
+      <w:r>
+        <w:rPr>
+          <w:b/>
+          <w:bCs/>
+        </w:rPr>
+        <w:t>Key Characteristics</w:t>
+      </w:r>
+    </w:p>
+    <w:p>
+      <w:pPr>
+        <w:numPr>
+          <w:ilvl w:val="0"/>
+          <w:numId w:val="44"/>
+        </w:numPr>
+      </w:pPr>
+      <w:r>
+        <w:rPr>
+          <w:b/>
+          <w:bCs/>
+        </w:rPr>
+        <w:t>Complete Binary Tree</w:t>
+      </w:r>
+      <w:r>
+        <w:t>: All levels of the tree are fully filled except possibly the last level, which is filled from left to right.</w:t>
+      </w:r>
+    </w:p>
+    <w:p>
+      <w:pPr>
+        <w:numPr>
+          <w:ilvl w:val="0"/>
+          <w:numId w:val="44"/>
+        </w:numPr>
+      </w:pPr>
+      <w:r>
+        <w:rPr>
+          <w:b/>
+          <w:bCs/>
+        </w:rPr>
+        <w:t>Heap Property</w:t>
+      </w:r>
+      <w:r>
+        <w:t>: In a max-heap, the key at the root is greater than or equal to the keys of its children, and this property is recursively true for all nodes. In a min-heap, the key at the root is less than or equal to the keys of its children.</w:t>
+      </w:r>
+    </w:p>
+    <w:p>
+      <w:pPr>
+        <w:rPr>
+          <w:b/>
+          <w:bCs/>
+        </w:rPr>
+      </w:pPr>
+      <w:r>
+        <w:rPr>
+          <w:b/>
+          <w:bCs/>
+        </w:rPr>
+        <w:t>Types of Binary Heaps</w:t>
+      </w:r>
+    </w:p>
+    <w:p>
+      <w:pPr>
+        <w:numPr>
+          <w:ilvl w:val="0"/>
+          <w:numId w:val="45"/>
+        </w:numPr>
+      </w:pPr>
+      <w:r>
+        <w:rPr>
+          <w:b/>
+          <w:bCs/>
+        </w:rPr>
+        <w:t>Max-Heap</w:t>
+      </w:r>
+      <w:r>
+        <w:t>: The maximum element is always at the root. Each parent node has a value greater than or equal to its children.</w:t>
+      </w:r>
+    </w:p>
+    <w:p>
+      <w:pPr>
+        <w:numPr>
+          <w:ilvl w:val="0"/>
+          <w:numId w:val="45"/>
+        </w:numPr>
+      </w:pPr>
+      <w:r>
+        <w:rPr>
+          <w:b/>
+          <w:bCs/>
+        </w:rPr>
+        <w:t>Min-Heap</w:t>
+      </w:r>
+      <w:r>
+        <w:t>: The minimum element is always at the root. Each parent node has a value less than or equal to its children.</w:t>
+      </w:r>
+    </w:p>
+    <w:p>
+      <w:pPr>
+        <w:rPr>
+          <w:b/>
+          <w:bCs/>
+        </w:rPr>
+      </w:pPr>
+      <w:r>
+        <w:rPr>
+          <w:b/>
+          <w:bCs/>
+        </w:rPr>
+        <w:t>Operations on Binary Heap</w:t>
+      </w:r>
+    </w:p>
+    <w:p>
+      <w:pPr>
+        <w:numPr>
+          <w:ilvl w:val="0"/>
+          <w:numId w:val="46"/>
+        </w:numPr>
+      </w:pPr>
+      <w:r>
+        <w:rPr>
+          <w:b/>
+          <w:bCs/>
+        </w:rPr>
+        <w:lastRenderedPageBreak/>
+        <w:t>Insert</w:t>
+      </w:r>
+      <w:r>
+        <w:t xml:space="preserve">: Add a new element at the end of the tree and then perform an up-heap operation to restore the heap property. Time complexity: </w:t>
+      </w:r>
+      <w:proofErr w:type="gramStart"/>
+      <w:r>
+        <w:rPr>
+          <w:b/>
+          <w:bCs/>
+        </w:rPr>
+        <w:t>O(</w:t>
+      </w:r>
+      <w:proofErr w:type="gramEnd"/>
+      <w:r>
+        <w:rPr>
+          <w:b/>
+          <w:bCs/>
+        </w:rPr>
+        <w:t>log n)</w:t>
+      </w:r>
+      <w:r>
+        <w:t>.</w:t>
+      </w:r>
+    </w:p>
+    <w:p>
+      <w:pPr>
+        <w:numPr>
+          <w:ilvl w:val="0"/>
+          <w:numId w:val="46"/>
+        </w:numPr>
+      </w:pPr>
+      <w:r>
+        <w:rPr>
+          <w:b/>
+          <w:bCs/>
+        </w:rPr>
+        <w:t>Extract-Min/Max</w:t>
+      </w:r>
+      <w:r>
+        <w:t xml:space="preserve">: Remove the root element, replace it with the last element, and then perform a down-heap operation to restore the heap property. Time complexity: </w:t>
+      </w:r>
+      <w:proofErr w:type="gramStart"/>
+      <w:r>
+        <w:rPr>
+          <w:b/>
+          <w:bCs/>
+        </w:rPr>
+        <w:t>O(</w:t>
+      </w:r>
+      <w:proofErr w:type="gramEnd"/>
+      <w:r>
+        <w:rPr>
+          <w:b/>
+          <w:bCs/>
+        </w:rPr>
+        <w:t>log n)</w:t>
+      </w:r>
+      <w:r>
+        <w:t>.</w:t>
+      </w:r>
+    </w:p>
+    <w:p>
+      <w:pPr>
+        <w:numPr>
+          <w:ilvl w:val="0"/>
+          <w:numId w:val="46"/>
+        </w:numPr>
+      </w:pPr>
+      <w:r>
+        <w:rPr>
+          <w:b/>
+          <w:bCs/>
+        </w:rPr>
+        <w:t>Decrease/Increase Key</w:t>
+      </w:r>
+      <w:r>
+        <w:t xml:space="preserve">: Change the value of a node and then perform up-heap or down-heap operations to restore the heap property. Time complexity: </w:t>
+      </w:r>
+      <w:proofErr w:type="gramStart"/>
+      <w:r>
+        <w:rPr>
+          <w:b/>
+          <w:bCs/>
+        </w:rPr>
+        <w:t>O(</w:t>
+      </w:r>
+      <w:proofErr w:type="gramEnd"/>
+      <w:r>
+        <w:rPr>
+          <w:b/>
+          <w:bCs/>
+        </w:rPr>
+        <w:t>log n)</w:t>
+      </w:r>
+      <w:r>
+        <w:t>.</w:t>
+      </w:r>
+    </w:p>
+    <w:p>
+      <w:pPr>
+        <w:numPr>
+          <w:ilvl w:val="0"/>
+          <w:numId w:val="46"/>
+        </w:numPr>
+      </w:pPr>
+      <w:r>
+        <w:rPr>
+          <w:b/>
+          <w:bCs/>
+        </w:rPr>
+        <w:t>Get Min/Max</w:t>
+      </w:r>
+      <w:r>
+        <w:t xml:space="preserve">: Return the root element. Time complexity: </w:t>
+      </w:r>
+      <w:proofErr w:type="gramStart"/>
+      <w:r>
+        <w:rPr>
+          <w:b/>
+          <w:bCs/>
+        </w:rPr>
+        <w:t>O(</w:t>
+      </w:r>
+      <w:proofErr w:type="gramEnd"/>
+      <w:r>
+        <w:rPr>
+          <w:b/>
+          <w:bCs/>
+        </w:rPr>
+        <w:t>1)</w:t>
+      </w:r>
+      <w:r>
+        <w:t>.</w:t>
+      </w:r>
+    </w:p>
+    <w:p>
+      <w:pPr>
+        <w:rPr>
+          <w:b/>
+          <w:bCs/>
+        </w:rPr>
+      </w:pPr>
+      <w:r>
+        <w:rPr>
+          <w:b/>
+          <w:bCs/>
+        </w:rPr>
+        <w:t>Applications</w:t>
+      </w:r>
+    </w:p>
+    <w:p>
+      <w:pPr>
+        <w:numPr>
+          <w:ilvl w:val="0"/>
+          <w:numId w:val="47"/>
+        </w:numPr>
+      </w:pPr>
+      <w:r>
+        <w:rPr>
+          <w:b/>
+          <w:bCs/>
+        </w:rPr>
+        <w:t>Priority Queue</w:t>
+      </w:r>
+      <w:r>
+        <w:t>: Efficiently supports insert, delete, and extract operations.</w:t>
+      </w:r>
+    </w:p>
+    <w:p>
+      <w:pPr>
+        <w:numPr>
+          <w:ilvl w:val="0"/>
+          <w:numId w:val="47"/>
+        </w:numPr>
+      </w:pPr>
+      <w:r>
+        <w:rPr>
+          <w:b/>
+          <w:bCs/>
+        </w:rPr>
+        <w:t>Graph Algorithms</w:t>
+      </w:r>
+      <w:r>
+        <w:t>: Used in algorithms like Dijkstra's shortest path and Prim's minimum spanning tree.</w:t>
+      </w:r>
+    </w:p>
+    <w:p>
+      <w:pPr>
+        <w:numPr>
+          <w:ilvl w:val="0"/>
+          <w:numId w:val="47"/>
+        </w:numPr>
+      </w:pPr>
+      <w:r>
+        <w:rPr>
+          <w:b/>
+          <w:bCs/>
+        </w:rPr>
+        <w:t>Heap Sort</w:t>
+      </w:r>
+      <w:r>
+        <w:t>: An efficient sorting algorithm that uses a binary heap.</w:t>
+      </w:r>
+    </w:p>
+    <w:p>
+      <w:r>
+        <w:t>Binary heaps are a fundamental data structure with numerous applications in computer science and are essential for efficient priority queue operations and various graph algorithms.</w:t>
       </w:r>
     </w:p>
     <w:p/>
@@ -2605,6 +2980,232 @@
     </w:lvl>
   </w:abstractNum>
   <w:abstractNum w:abstractNumId="5" w15:restartNumberingAfterBreak="0">
+    <w:nsid w:val="1FE138D0"/>
+    <w:multiLevelType w:val="multilevel"/>
+    <w:tmpl w:val="7C6A57CE"/>
+    <w:lvl w:ilvl="0">
+      <w:start w:val="1"/>
+      <w:numFmt w:val="decimal"/>
+      <w:lvlText w:val="%1."/>
+      <w:lvlJc w:val="left"/>
+      <w:pPr>
+        <w:tabs>
+          <w:tab w:val="num" w:pos="720"/>
+        </w:tabs>
+        <w:ind w:left="720" w:hanging="360"/>
+      </w:pPr>
+    </w:lvl>
+    <w:lvl w:ilvl="1" w:tentative="1">
+      <w:start w:val="1"/>
+      <w:numFmt w:val="decimal"/>
+      <w:lvlText w:val="%2."/>
+      <w:lvlJc w:val="left"/>
+      <w:pPr>
+        <w:tabs>
+          <w:tab w:val="num" w:pos="1440"/>
+        </w:tabs>
+        <w:ind w:left="1440" w:hanging="360"/>
+      </w:pPr>
+    </w:lvl>
+    <w:lvl w:ilvl="2" w:tentative="1">
+      <w:start w:val="1"/>
+      <w:numFmt w:val="decimal"/>
+      <w:lvlText w:val="%3."/>
+      <w:lvlJc w:val="left"/>
+      <w:pPr>
+        <w:tabs>
+          <w:tab w:val="num" w:pos="2160"/>
+        </w:tabs>
+        <w:ind w:left="2160" w:hanging="360"/>
+      </w:pPr>
+    </w:lvl>
+    <w:lvl w:ilvl="3" w:tentative="1">
+      <w:start w:val="1"/>
+      <w:numFmt w:val="decimal"/>
+      <w:lvlText w:val="%4."/>
+      <w:lvlJc w:val="left"/>
+      <w:pPr>
+        <w:tabs>
+          <w:tab w:val="num" w:pos="2880"/>
+        </w:tabs>
+        <w:ind w:left="2880" w:hanging="360"/>
+      </w:pPr>
+    </w:lvl>
+    <w:lvl w:ilvl="4" w:tentative="1">
+      <w:start w:val="1"/>
+      <w:numFmt w:val="decimal"/>
+      <w:lvlText w:val="%5."/>
+      <w:lvlJc w:val="left"/>
+      <w:pPr>
+        <w:tabs>
+          <w:tab w:val="num" w:pos="3600"/>
+        </w:tabs>
+        <w:ind w:left="3600" w:hanging="360"/>
+      </w:pPr>
+    </w:lvl>
+    <w:lvl w:ilvl="5" w:tentative="1">
+      <w:start w:val="1"/>
+      <w:numFmt w:val="decimal"/>
+      <w:lvlText w:val="%6."/>
+      <w:lvlJc w:val="left"/>
+      <w:pPr>
+        <w:tabs>
+          <w:tab w:val="num" w:pos="4320"/>
+        </w:tabs>
+        <w:ind w:left="4320" w:hanging="360"/>
+      </w:pPr>
+    </w:lvl>
+    <w:lvl w:ilvl="6" w:tentative="1">
+      <w:start w:val="1"/>
+      <w:numFmt w:val="decimal"/>
+      <w:lvlText w:val="%7."/>
+      <w:lvlJc w:val="left"/>
+      <w:pPr>
+        <w:tabs>
+          <w:tab w:val="num" w:pos="5040"/>
+        </w:tabs>
+        <w:ind w:left="5040" w:hanging="360"/>
+      </w:pPr>
+    </w:lvl>
+    <w:lvl w:ilvl="7" w:tentative="1">
+      <w:start w:val="1"/>
+      <w:numFmt w:val="decimal"/>
+      <w:lvlText w:val="%8."/>
+      <w:lvlJc w:val="left"/>
+      <w:pPr>
+        <w:tabs>
+          <w:tab w:val="num" w:pos="5760"/>
+        </w:tabs>
+        <w:ind w:left="5760" w:hanging="360"/>
+      </w:pPr>
+    </w:lvl>
+    <w:lvl w:ilvl="8" w:tentative="1">
+      <w:start w:val="1"/>
+      <w:numFmt w:val="decimal"/>
+      <w:lvlText w:val="%9."/>
+      <w:lvlJc w:val="left"/>
+      <w:pPr>
+        <w:tabs>
+          <w:tab w:val="num" w:pos="6480"/>
+        </w:tabs>
+        <w:ind w:left="6480" w:hanging="360"/>
+      </w:pPr>
+    </w:lvl>
+  </w:abstractNum>
+  <w:abstractNum w:abstractNumId="6" w15:restartNumberingAfterBreak="0">
+    <w:nsid w:val="23A82454"/>
+    <w:multiLevelType w:val="multilevel"/>
+    <w:tmpl w:val="B2BED45C"/>
+    <w:lvl w:ilvl="0">
+      <w:start w:val="1"/>
+      <w:numFmt w:val="decimal"/>
+      <w:lvlText w:val="%1."/>
+      <w:lvlJc w:val="left"/>
+      <w:pPr>
+        <w:tabs>
+          <w:tab w:val="num" w:pos="720"/>
+        </w:tabs>
+        <w:ind w:left="720" w:hanging="360"/>
+      </w:pPr>
+    </w:lvl>
+    <w:lvl w:ilvl="1" w:tentative="1">
+      <w:start w:val="1"/>
+      <w:numFmt w:val="decimal"/>
+      <w:lvlText w:val="%2."/>
+      <w:lvlJc w:val="left"/>
+      <w:pPr>
+        <w:tabs>
+          <w:tab w:val="num" w:pos="1440"/>
+        </w:tabs>
+        <w:ind w:left="1440" w:hanging="360"/>
+      </w:pPr>
+    </w:lvl>
+    <w:lvl w:ilvl="2" w:tentative="1">
+      <w:start w:val="1"/>
+      <w:numFmt w:val="decimal"/>
+      <w:lvlText w:val="%3."/>
+      <w:lvlJc w:val="left"/>
+      <w:pPr>
+        <w:tabs>
+          <w:tab w:val="num" w:pos="2160"/>
+        </w:tabs>
+        <w:ind w:left="2160" w:hanging="360"/>
+      </w:pPr>
+    </w:lvl>
+    <w:lvl w:ilvl="3" w:tentative="1">
+      <w:start w:val="1"/>
+      <w:numFmt w:val="decimal"/>
+      <w:lvlText w:val="%4."/>
+      <w:lvlJc w:val="left"/>
+      <w:pPr>
+        <w:tabs>
+          <w:tab w:val="num" w:pos="2880"/>
+        </w:tabs>
+        <w:ind w:left="2880" w:hanging="360"/>
+      </w:pPr>
+    </w:lvl>
+    <w:lvl w:ilvl="4" w:tentative="1">
+      <w:start w:val="1"/>
+      <w:numFmt w:val="decimal"/>
+      <w:lvlText w:val="%5."/>
+      <w:lvlJc w:val="left"/>
+      <w:pPr>
+        <w:tabs>
+          <w:tab w:val="num" w:pos="3600"/>
+        </w:tabs>
+        <w:ind w:left="3600" w:hanging="360"/>
+      </w:pPr>
+    </w:lvl>
+    <w:lvl w:ilvl="5" w:tentative="1">
+      <w:start w:val="1"/>
+      <w:numFmt w:val="decimal"/>
+      <w:lvlText w:val="%6."/>
+      <w:lvlJc w:val="left"/>
+      <w:pPr>
+        <w:tabs>
+          <w:tab w:val="num" w:pos="4320"/>
+        </w:tabs>
+        <w:ind w:left="4320" w:hanging="360"/>
+      </w:pPr>
+    </w:lvl>
+    <w:lvl w:ilvl="6" w:tentative="1">
+      <w:start w:val="1"/>
+      <w:numFmt w:val="decimal"/>
+      <w:lvlText w:val="%7."/>
+      <w:lvlJc w:val="left"/>
+      <w:pPr>
+        <w:tabs>
+          <w:tab w:val="num" w:pos="5040"/>
+        </w:tabs>
+        <w:ind w:left="5040" w:hanging="360"/>
+      </w:pPr>
+    </w:lvl>
+    <w:lvl w:ilvl="7" w:tentative="1">
+      <w:start w:val="1"/>
+      <w:numFmt w:val="decimal"/>
+      <w:lvlText w:val="%8."/>
+      <w:lvlJc w:val="left"/>
+      <w:pPr>
+        <w:tabs>
+          <w:tab w:val="num" w:pos="5760"/>
+        </w:tabs>
+        <w:ind w:left="5760" w:hanging="360"/>
+      </w:pPr>
+    </w:lvl>
+    <w:lvl w:ilvl="8" w:tentative="1">
+      <w:start w:val="1"/>
+      <w:numFmt w:val="decimal"/>
+      <w:lvlText w:val="%9."/>
+      <w:lvlJc w:val="left"/>
+      <w:pPr>
+        <w:tabs>
+          <w:tab w:val="num" w:pos="6480"/>
+        </w:tabs>
+        <w:ind w:left="6480" w:hanging="360"/>
+      </w:pPr>
+    </w:lvl>
+  </w:abstractNum>
+  <w:abstractNum w:abstractNumId="7" w15:restartNumberingAfterBreak="0">
     <w:nsid w:val="28917ABA"/>
     <w:multiLevelType w:val="multilevel"/>
     <w:tmpl w:val="27ECEDEE"/>
@@ -2753,7 +3354,7 @@
       </w:rPr>
     </w:lvl>
   </w:abstractNum>
-  <w:abstractNum w:abstractNumId="6" w15:restartNumberingAfterBreak="0">
+  <w:abstractNum w:abstractNumId="8" w15:restartNumberingAfterBreak="0">
     <w:nsid w:val="28B26A1C"/>
     <w:multiLevelType w:val="multilevel"/>
     <w:tmpl w:val="290063A4"/>
@@ -2902,7 +3503,7 @@
       </w:rPr>
     </w:lvl>
   </w:abstractNum>
-  <w:abstractNum w:abstractNumId="7" w15:restartNumberingAfterBreak="0">
+  <w:abstractNum w:abstractNumId="9" w15:restartNumberingAfterBreak="0">
     <w:nsid w:val="28B611CF"/>
     <w:multiLevelType w:val="multilevel"/>
     <w:tmpl w:val="BE928092"/>
@@ -3051,7 +3652,7 @@
       </w:rPr>
     </w:lvl>
   </w:abstractNum>
-  <w:abstractNum w:abstractNumId="8" w15:restartNumberingAfterBreak="0">
+  <w:abstractNum w:abstractNumId="10" w15:restartNumberingAfterBreak="0">
     <w:nsid w:val="33A15A7D"/>
     <w:multiLevelType w:val="multilevel"/>
     <w:tmpl w:val="609CDFB4"/>
@@ -3200,7 +3801,7 @@
       </w:rPr>
     </w:lvl>
   </w:abstractNum>
-  <w:abstractNum w:abstractNumId="9" w15:restartNumberingAfterBreak="0">
+  <w:abstractNum w:abstractNumId="11" w15:restartNumberingAfterBreak="0">
     <w:nsid w:val="34530AB1"/>
     <w:multiLevelType w:val="multilevel"/>
     <w:tmpl w:val="9FC25600"/>
@@ -3313,7 +3914,7 @@
       </w:pPr>
     </w:lvl>
   </w:abstractNum>
-  <w:abstractNum w:abstractNumId="10" w15:restartNumberingAfterBreak="0">
+  <w:abstractNum w:abstractNumId="12" w15:restartNumberingAfterBreak="0">
     <w:nsid w:val="3E796E66"/>
     <w:multiLevelType w:val="multilevel"/>
     <w:tmpl w:val="3EF230CE"/>
@@ -3426,7 +4027,7 @@
       </w:pPr>
     </w:lvl>
   </w:abstractNum>
-  <w:abstractNum w:abstractNumId="11" w15:restartNumberingAfterBreak="0">
+  <w:abstractNum w:abstractNumId="13" w15:restartNumberingAfterBreak="0">
     <w:nsid w:val="413A0C2A"/>
     <w:multiLevelType w:val="multilevel"/>
     <w:tmpl w:val="C9705CD4"/>
@@ -3575,7 +4176,7 @@
       </w:rPr>
     </w:lvl>
   </w:abstractNum>
-  <w:abstractNum w:abstractNumId="12" w15:restartNumberingAfterBreak="0">
+  <w:abstractNum w:abstractNumId="14" w15:restartNumberingAfterBreak="0">
     <w:nsid w:val="4287678B"/>
     <w:multiLevelType w:val="multilevel"/>
     <w:tmpl w:val="0576C1DC"/>
@@ -3692,7 +4293,7 @@
       </w:pPr>
     </w:lvl>
   </w:abstractNum>
-  <w:abstractNum w:abstractNumId="13" w15:restartNumberingAfterBreak="0">
+  <w:abstractNum w:abstractNumId="15" w15:restartNumberingAfterBreak="0">
     <w:nsid w:val="43D33BD0"/>
     <w:multiLevelType w:val="multilevel"/>
     <w:tmpl w:val="D56C1DC2"/>
@@ -3841,7 +4442,7 @@
       </w:rPr>
     </w:lvl>
   </w:abstractNum>
-  <w:abstractNum w:abstractNumId="14" w15:restartNumberingAfterBreak="0">
+  <w:abstractNum w:abstractNumId="16" w15:restartNumberingAfterBreak="0">
     <w:nsid w:val="46340A9B"/>
     <w:multiLevelType w:val="multilevel"/>
     <w:tmpl w:val="14BE2736"/>
@@ -3990,7 +4591,7 @@
       </w:rPr>
     </w:lvl>
   </w:abstractNum>
-  <w:abstractNum w:abstractNumId="15" w15:restartNumberingAfterBreak="0">
+  <w:abstractNum w:abstractNumId="17" w15:restartNumberingAfterBreak="0">
     <w:nsid w:val="477F10F4"/>
     <w:multiLevelType w:val="multilevel"/>
     <w:tmpl w:val="260E5CD4"/>
@@ -4139,7 +4740,156 @@
       </w:rPr>
     </w:lvl>
   </w:abstractNum>
-  <w:abstractNum w:abstractNumId="16" w15:restartNumberingAfterBreak="0">
+  <w:abstractNum w:abstractNumId="18" w15:restartNumberingAfterBreak="0">
+    <w:nsid w:val="4D3F2B3A"/>
+    <w:multiLevelType w:val="multilevel"/>
+    <w:tmpl w:val="3A5AF704"/>
+    <w:lvl w:ilvl="0">
+      <w:start w:val="1"/>
+      <w:numFmt w:val="bullet"/>
+      <w:lvlText w:val=""/>
+      <w:lvlJc w:val="left"/>
+      <w:pPr>
+        <w:tabs>
+          <w:tab w:val="num" w:pos="720"/>
+        </w:tabs>
+        <w:ind w:left="720" w:hanging="360"/>
+      </w:pPr>
+      <w:rPr>
+        <w:rFonts w:ascii="Symbol" w:hAnsi="Symbol" w:hint="default"/>
+        <w:sz w:val="20"/>
+      </w:rPr>
+    </w:lvl>
+    <w:lvl w:ilvl="1" w:tentative="1">
+      <w:start w:val="1"/>
+      <w:numFmt w:val="bullet"/>
+      <w:lvlText w:val="o"/>
+      <w:lvlJc w:val="left"/>
+      <w:pPr>
+        <w:tabs>
+          <w:tab w:val="num" w:pos="1440"/>
+        </w:tabs>
+        <w:ind w:left="1440" w:hanging="360"/>
+      </w:pPr>
+      <w:rPr>
+        <w:rFonts w:ascii="Courier New" w:hAnsi="Courier New" w:hint="default"/>
+        <w:sz w:val="20"/>
+      </w:rPr>
+    </w:lvl>
+    <w:lvl w:ilvl="2" w:tentative="1">
+      <w:start w:val="1"/>
+      <w:numFmt w:val="bullet"/>
+      <w:lvlText w:val=""/>
+      <w:lvlJc w:val="left"/>
+      <w:pPr>
+        <w:tabs>
+          <w:tab w:val="num" w:pos="2160"/>
+        </w:tabs>
+        <w:ind w:left="2160" w:hanging="360"/>
+      </w:pPr>
+      <w:rPr>
+        <w:rFonts w:ascii="Wingdings" w:hAnsi="Wingdings" w:hint="default"/>
+        <w:sz w:val="20"/>
+      </w:rPr>
+    </w:lvl>
+    <w:lvl w:ilvl="3" w:tentative="1">
+      <w:start w:val="1"/>
+      <w:numFmt w:val="bullet"/>
+      <w:lvlText w:val=""/>
+      <w:lvlJc w:val="left"/>
+      <w:pPr>
+        <w:tabs>
+          <w:tab w:val="num" w:pos="2880"/>
+        </w:tabs>
+        <w:ind w:left="2880" w:hanging="360"/>
+      </w:pPr>
+      <w:rPr>
+        <w:rFonts w:ascii="Wingdings" w:hAnsi="Wingdings" w:hint="default"/>
+        <w:sz w:val="20"/>
+      </w:rPr>
+    </w:lvl>
+    <w:lvl w:ilvl="4" w:tentative="1">
+      <w:start w:val="1"/>
+      <w:numFmt w:val="bullet"/>
+      <w:lvlText w:val=""/>
+      <w:lvlJc w:val="left"/>
+      <w:pPr>
+        <w:tabs>
+          <w:tab w:val="num" w:pos="3600"/>
+        </w:tabs>
+        <w:ind w:left="3600" w:hanging="360"/>
+      </w:pPr>
+      <w:rPr>
+        <w:rFonts w:ascii="Wingdings" w:hAnsi="Wingdings" w:hint="default"/>
+        <w:sz w:val="20"/>
+      </w:rPr>
+    </w:lvl>
+    <w:lvl w:ilvl="5" w:tentative="1">
+      <w:start w:val="1"/>
+      <w:numFmt w:val="bullet"/>
+      <w:lvlText w:val=""/>
+      <w:lvlJc w:val="left"/>
+      <w:pPr>
+        <w:tabs>
+          <w:tab w:val="num" w:pos="4320"/>
+        </w:tabs>
+        <w:ind w:left="4320" w:hanging="360"/>
+      </w:pPr>
+      <w:rPr>
+        <w:rFonts w:ascii="Wingdings" w:hAnsi="Wingdings" w:hint="default"/>
+        <w:sz w:val="20"/>
+      </w:rPr>
+    </w:lvl>
+    <w:lvl w:ilvl="6" w:tentative="1">
+      <w:start w:val="1"/>
+      <w:numFmt w:val="bullet"/>
+      <w:lvlText w:val=""/>
+      <w:lvlJc w:val="left"/>
+      <w:pPr>
+        <w:tabs>
+          <w:tab w:val="num" w:pos="5040"/>
+        </w:tabs>
+        <w:ind w:left="5040" w:hanging="360"/>
+      </w:pPr>
+      <w:rPr>
+        <w:rFonts w:ascii="Wingdings" w:hAnsi="Wingdings" w:hint="default"/>
+        <w:sz w:val="20"/>
+      </w:rPr>
+    </w:lvl>
+    <w:lvl w:ilvl="7" w:tentative="1">
+      <w:start w:val="1"/>
+      <w:numFmt w:val="bullet"/>
+      <w:lvlText w:val=""/>
+      <w:lvlJc w:val="left"/>
+      <w:pPr>
+        <w:tabs>
+          <w:tab w:val="num" w:pos="5760"/>
+        </w:tabs>
+        <w:ind w:left="5760" w:hanging="360"/>
+      </w:pPr>
+      <w:rPr>
+        <w:rFonts w:ascii="Wingdings" w:hAnsi="Wingdings" w:hint="default"/>
+        <w:sz w:val="20"/>
+      </w:rPr>
+    </w:lvl>
+    <w:lvl w:ilvl="8" w:tentative="1">
+      <w:start w:val="1"/>
+      <w:numFmt w:val="bullet"/>
+      <w:lvlText w:val=""/>
+      <w:lvlJc w:val="left"/>
+      <w:pPr>
+        <w:tabs>
+          <w:tab w:val="num" w:pos="6480"/>
+        </w:tabs>
+        <w:ind w:left="6480" w:hanging="360"/>
+      </w:pPr>
+      <w:rPr>
+        <w:rFonts w:ascii="Wingdings" w:hAnsi="Wingdings" w:hint="default"/>
+        <w:sz w:val="20"/>
+      </w:rPr>
+    </w:lvl>
+  </w:abstractNum>
+  <w:abstractNum w:abstractNumId="19" w15:restartNumberingAfterBreak="0">
     <w:nsid w:val="51614816"/>
     <w:multiLevelType w:val="multilevel"/>
     <w:tmpl w:val="88DCF1F8"/>
@@ -4288,7 +5038,7 @@
       </w:rPr>
     </w:lvl>
   </w:abstractNum>
-  <w:abstractNum w:abstractNumId="17" w15:restartNumberingAfterBreak="0">
+  <w:abstractNum w:abstractNumId="20" w15:restartNumberingAfterBreak="0">
     <w:nsid w:val="545347DF"/>
     <w:multiLevelType w:val="multilevel"/>
     <w:tmpl w:val="DBD65760"/>
@@ -4437,7 +5187,7 @@
       </w:rPr>
     </w:lvl>
   </w:abstractNum>
-  <w:abstractNum w:abstractNumId="18" w15:restartNumberingAfterBreak="0">
+  <w:abstractNum w:abstractNumId="21" w15:restartNumberingAfterBreak="0">
     <w:nsid w:val="549E7C28"/>
     <w:multiLevelType w:val="multilevel"/>
     <w:tmpl w:val="9CC2339A"/>
@@ -4586,7 +5336,7 @@
       </w:rPr>
     </w:lvl>
   </w:abstractNum>
-  <w:abstractNum w:abstractNumId="19" w15:restartNumberingAfterBreak="0">
+  <w:abstractNum w:abstractNumId="22" w15:restartNumberingAfterBreak="0">
     <w:nsid w:val="5D7472D3"/>
     <w:multiLevelType w:val="multilevel"/>
     <w:tmpl w:val="B9A81A2E"/>
@@ -4735,7 +5485,7 @@
       </w:rPr>
     </w:lvl>
   </w:abstractNum>
-  <w:abstractNum w:abstractNumId="20" w15:restartNumberingAfterBreak="0">
+  <w:abstractNum w:abstractNumId="23" w15:restartNumberingAfterBreak="0">
     <w:nsid w:val="5E0E1A4F"/>
     <w:multiLevelType w:val="multilevel"/>
     <w:tmpl w:val="F0FEEB9E"/>
@@ -4884,7 +5634,7 @@
       </w:rPr>
     </w:lvl>
   </w:abstractNum>
-  <w:abstractNum w:abstractNumId="21" w15:restartNumberingAfterBreak="0">
+  <w:abstractNum w:abstractNumId="24" w15:restartNumberingAfterBreak="0">
     <w:nsid w:val="5EE83B0D"/>
     <w:multiLevelType w:val="multilevel"/>
     <w:tmpl w:val="68061376"/>
@@ -5033,7 +5783,7 @@
       </w:rPr>
     </w:lvl>
   </w:abstractNum>
-  <w:abstractNum w:abstractNumId="22" w15:restartNumberingAfterBreak="0">
+  <w:abstractNum w:abstractNumId="25" w15:restartNumberingAfterBreak="0">
     <w:nsid w:val="61C173CD"/>
     <w:multiLevelType w:val="multilevel"/>
     <w:tmpl w:val="B4164562"/>
@@ -5182,7 +5932,156 @@
       </w:rPr>
     </w:lvl>
   </w:abstractNum>
-  <w:abstractNum w:abstractNumId="23" w15:restartNumberingAfterBreak="0">
+  <w:abstractNum w:abstractNumId="26" w15:restartNumberingAfterBreak="0">
+    <w:nsid w:val="6D397EC9"/>
+    <w:multiLevelType w:val="multilevel"/>
+    <w:tmpl w:val="6D48EF12"/>
+    <w:lvl w:ilvl="0">
+      <w:start w:val="1"/>
+      <w:numFmt w:val="bullet"/>
+      <w:lvlText w:val=""/>
+      <w:lvlJc w:val="left"/>
+      <w:pPr>
+        <w:tabs>
+          <w:tab w:val="num" w:pos="720"/>
+        </w:tabs>
+        <w:ind w:left="720" w:hanging="360"/>
+      </w:pPr>
+      <w:rPr>
+        <w:rFonts w:ascii="Symbol" w:hAnsi="Symbol" w:hint="default"/>
+        <w:sz w:val="20"/>
+      </w:rPr>
+    </w:lvl>
+    <w:lvl w:ilvl="1" w:tentative="1">
+      <w:start w:val="1"/>
+      <w:numFmt w:val="bullet"/>
+      <w:lvlText w:val="o"/>
+      <w:lvlJc w:val="left"/>
+      <w:pPr>
+        <w:tabs>
+          <w:tab w:val="num" w:pos="1440"/>
+        </w:tabs>
+        <w:ind w:left="1440" w:hanging="360"/>
+      </w:pPr>
+      <w:rPr>
+        <w:rFonts w:ascii="Courier New" w:hAnsi="Courier New" w:hint="default"/>
+        <w:sz w:val="20"/>
+      </w:rPr>
+    </w:lvl>
+    <w:lvl w:ilvl="2" w:tentative="1">
+      <w:start w:val="1"/>
+      <w:numFmt w:val="bullet"/>
+      <w:lvlText w:val=""/>
+      <w:lvlJc w:val="left"/>
+      <w:pPr>
+        <w:tabs>
+          <w:tab w:val="num" w:pos="2160"/>
+        </w:tabs>
+        <w:ind w:left="2160" w:hanging="360"/>
+      </w:pPr>
+      <w:rPr>
+        <w:rFonts w:ascii="Wingdings" w:hAnsi="Wingdings" w:hint="default"/>
+        <w:sz w:val="20"/>
+      </w:rPr>
+    </w:lvl>
+    <w:lvl w:ilvl="3" w:tentative="1">
+      <w:start w:val="1"/>
+      <w:numFmt w:val="bullet"/>
+      <w:lvlText w:val=""/>
+      <w:lvlJc w:val="left"/>
+      <w:pPr>
+        <w:tabs>
+          <w:tab w:val="num" w:pos="2880"/>
+        </w:tabs>
+        <w:ind w:left="2880" w:hanging="360"/>
+      </w:pPr>
+      <w:rPr>
+        <w:rFonts w:ascii="Wingdings" w:hAnsi="Wingdings" w:hint="default"/>
+        <w:sz w:val="20"/>
+      </w:rPr>
+    </w:lvl>
+    <w:lvl w:ilvl="4" w:tentative="1">
+      <w:start w:val="1"/>
+      <w:numFmt w:val="bullet"/>
+      <w:lvlText w:val=""/>
+      <w:lvlJc w:val="left"/>
+      <w:pPr>
+        <w:tabs>
+          <w:tab w:val="num" w:pos="3600"/>
+        </w:tabs>
+        <w:ind w:left="3600" w:hanging="360"/>
+      </w:pPr>
+      <w:rPr>
+        <w:rFonts w:ascii="Wingdings" w:hAnsi="Wingdings" w:hint="default"/>
+        <w:sz w:val="20"/>
+      </w:rPr>
+    </w:lvl>
+    <w:lvl w:ilvl="5" w:tentative="1">
+      <w:start w:val="1"/>
+      <w:numFmt w:val="bullet"/>
+      <w:lvlText w:val=""/>
+      <w:lvlJc w:val="left"/>
+      <w:pPr>
+        <w:tabs>
+          <w:tab w:val="num" w:pos="4320"/>
+        </w:tabs>
+        <w:ind w:left="4320" w:hanging="360"/>
+      </w:pPr>
+      <w:rPr>
+        <w:rFonts w:ascii="Wingdings" w:hAnsi="Wingdings" w:hint="default"/>
+        <w:sz w:val="20"/>
+      </w:rPr>
+    </w:lvl>
+    <w:lvl w:ilvl="6" w:tentative="1">
+      <w:start w:val="1"/>
+      <w:numFmt w:val="bullet"/>
+      <w:lvlText w:val=""/>
+      <w:lvlJc w:val="left"/>
+      <w:pPr>
+        <w:tabs>
+          <w:tab w:val="num" w:pos="5040"/>
+        </w:tabs>
+        <w:ind w:left="5040" w:hanging="360"/>
+      </w:pPr>
+      <w:rPr>
+        <w:rFonts w:ascii="Wingdings" w:hAnsi="Wingdings" w:hint="default"/>
+        <w:sz w:val="20"/>
+      </w:rPr>
+    </w:lvl>
+    <w:lvl w:ilvl="7" w:tentative="1">
+      <w:start w:val="1"/>
+      <w:numFmt w:val="bullet"/>
+      <w:lvlText w:val=""/>
+      <w:lvlJc w:val="left"/>
+      <w:pPr>
+        <w:tabs>
+          <w:tab w:val="num" w:pos="5760"/>
+        </w:tabs>
+        <w:ind w:left="5760" w:hanging="360"/>
+      </w:pPr>
+      <w:rPr>
+        <w:rFonts w:ascii="Wingdings" w:hAnsi="Wingdings" w:hint="default"/>
+        <w:sz w:val="20"/>
+      </w:rPr>
+    </w:lvl>
+    <w:lvl w:ilvl="8" w:tentative="1">
+      <w:start w:val="1"/>
+      <w:numFmt w:val="bullet"/>
+      <w:lvlText w:val=""/>
+      <w:lvlJc w:val="left"/>
+      <w:pPr>
+        <w:tabs>
+          <w:tab w:val="num" w:pos="6480"/>
+        </w:tabs>
+        <w:ind w:left="6480" w:hanging="360"/>
+      </w:pPr>
+      <w:rPr>
+        <w:rFonts w:ascii="Wingdings" w:hAnsi="Wingdings" w:hint="default"/>
+        <w:sz w:val="20"/>
+      </w:rPr>
+    </w:lvl>
+  </w:abstractNum>
+  <w:abstractNum w:abstractNumId="27" w15:restartNumberingAfterBreak="0">
     <w:nsid w:val="6D5E74AC"/>
     <w:multiLevelType w:val="multilevel"/>
     <w:tmpl w:val="6540DB56"/>
@@ -5331,7 +6230,7 @@
       </w:rPr>
     </w:lvl>
   </w:abstractNum>
-  <w:abstractNum w:abstractNumId="24" w15:restartNumberingAfterBreak="0">
+  <w:abstractNum w:abstractNumId="28" w15:restartNumberingAfterBreak="0">
     <w:nsid w:val="71482A39"/>
     <w:multiLevelType w:val="multilevel"/>
     <w:tmpl w:val="F36E5B70"/>
@@ -5481,61 +6380,61 @@
     </w:lvl>
   </w:abstractNum>
   <w:num w:numId="1" w16cid:durableId="24672479">
-    <w:abstractNumId w:val="18"/>
+    <w:abstractNumId w:val="21"/>
   </w:num>
   <w:num w:numId="2" w16cid:durableId="1750694285">
-    <w:abstractNumId w:val="14"/>
+    <w:abstractNumId w:val="16"/>
   </w:num>
   <w:num w:numId="3" w16cid:durableId="1419642760">
-    <w:abstractNumId w:val="20"/>
+    <w:abstractNumId w:val="23"/>
   </w:num>
   <w:num w:numId="4" w16cid:durableId="163282510">
-    <w:abstractNumId w:val="6"/>
+    <w:abstractNumId w:val="8"/>
   </w:num>
   <w:num w:numId="5" w16cid:durableId="1471248515">
-    <w:abstractNumId w:val="11"/>
+    <w:abstractNumId w:val="13"/>
   </w:num>
   <w:num w:numId="6" w16cid:durableId="1112358828">
     <w:abstractNumId w:val="3"/>
   </w:num>
   <w:num w:numId="7" w16cid:durableId="225382795">
-    <w:abstractNumId w:val="10"/>
+    <w:abstractNumId w:val="12"/>
     <w:lvlOverride w:ilvl="0">
       <w:startOverride w:val="1"/>
     </w:lvlOverride>
   </w:num>
   <w:num w:numId="8" w16cid:durableId="931934047">
-    <w:abstractNumId w:val="10"/>
+    <w:abstractNumId w:val="12"/>
     <w:lvlOverride w:ilvl="0">
       <w:startOverride w:val="2"/>
     </w:lvlOverride>
   </w:num>
   <w:num w:numId="9" w16cid:durableId="20866261">
-    <w:abstractNumId w:val="10"/>
+    <w:abstractNumId w:val="12"/>
     <w:lvlOverride w:ilvl="0">
       <w:startOverride w:val="3"/>
     </w:lvlOverride>
   </w:num>
   <w:num w:numId="10" w16cid:durableId="1309629098">
-    <w:abstractNumId w:val="10"/>
+    <w:abstractNumId w:val="12"/>
     <w:lvlOverride w:ilvl="0">
       <w:startOverride w:val="4"/>
     </w:lvlOverride>
   </w:num>
   <w:num w:numId="11" w16cid:durableId="1161775105">
-    <w:abstractNumId w:val="10"/>
+    <w:abstractNumId w:val="12"/>
     <w:lvlOverride w:ilvl="0">
       <w:startOverride w:val="5"/>
     </w:lvlOverride>
   </w:num>
   <w:num w:numId="12" w16cid:durableId="14500964">
-    <w:abstractNumId w:val="16"/>
+    <w:abstractNumId w:val="19"/>
     <w:lvlOverride w:ilvl="0">
       <w:startOverride w:val="1"/>
     </w:lvlOverride>
   </w:num>
   <w:num w:numId="13" w16cid:durableId="910894460">
-    <w:abstractNumId w:val="16"/>
+    <w:abstractNumId w:val="19"/>
     <w:lvlOverride w:ilvl="0">
       <w:startOverride w:val="2"/>
     </w:lvlOverride>
@@ -5553,19 +6452,19 @@
     </w:lvlOverride>
   </w:num>
   <w:num w:numId="16" w16cid:durableId="2001300294">
-    <w:abstractNumId w:val="9"/>
+    <w:abstractNumId w:val="11"/>
     <w:lvlOverride w:ilvl="0">
       <w:startOverride w:val="1"/>
     </w:lvlOverride>
   </w:num>
   <w:num w:numId="17" w16cid:durableId="1395279969">
-    <w:abstractNumId w:val="9"/>
+    <w:abstractNumId w:val="11"/>
     <w:lvlOverride w:ilvl="0">
       <w:startOverride w:val="2"/>
     </w:lvlOverride>
   </w:num>
   <w:num w:numId="18" w16cid:durableId="1642151425">
-    <w:abstractNumId w:val="9"/>
+    <w:abstractNumId w:val="11"/>
     <w:lvlOverride w:ilvl="0">
       <w:startOverride w:val="3"/>
     </w:lvlOverride>
@@ -5583,111 +6482,123 @@
     </w:lvlOverride>
   </w:num>
   <w:num w:numId="21" w16cid:durableId="668214397">
-    <w:abstractNumId w:val="12"/>
+    <w:abstractNumId w:val="14"/>
     <w:lvlOverride w:ilvl="0">
       <w:startOverride w:val="1"/>
     </w:lvlOverride>
   </w:num>
   <w:num w:numId="22" w16cid:durableId="26177118">
-    <w:abstractNumId w:val="12"/>
+    <w:abstractNumId w:val="14"/>
     <w:lvlOverride w:ilvl="0">
       <w:startOverride w:val="2"/>
     </w:lvlOverride>
   </w:num>
   <w:num w:numId="23" w16cid:durableId="1534272156">
-    <w:abstractNumId w:val="12"/>
+    <w:abstractNumId w:val="14"/>
     <w:lvlOverride w:ilvl="0"/>
     <w:lvlOverride w:ilvl="1">
       <w:startOverride w:val="1"/>
     </w:lvlOverride>
   </w:num>
   <w:num w:numId="24" w16cid:durableId="1999112611">
-    <w:abstractNumId w:val="12"/>
+    <w:abstractNumId w:val="14"/>
     <w:lvlOverride w:ilvl="0"/>
     <w:lvlOverride w:ilvl="1">
       <w:startOverride w:val="2"/>
     </w:lvlOverride>
   </w:num>
   <w:num w:numId="25" w16cid:durableId="289559563">
-    <w:abstractNumId w:val="22"/>
+    <w:abstractNumId w:val="25"/>
     <w:lvlOverride w:ilvl="0">
       <w:startOverride w:val="1"/>
     </w:lvlOverride>
   </w:num>
   <w:num w:numId="26" w16cid:durableId="449780366">
-    <w:abstractNumId w:val="22"/>
+    <w:abstractNumId w:val="25"/>
     <w:lvlOverride w:ilvl="0">
       <w:startOverride w:val="2"/>
     </w:lvlOverride>
   </w:num>
   <w:num w:numId="27" w16cid:durableId="1883012699">
-    <w:abstractNumId w:val="22"/>
+    <w:abstractNumId w:val="25"/>
     <w:lvlOverride w:ilvl="0">
       <w:startOverride w:val="3"/>
     </w:lvlOverride>
   </w:num>
   <w:num w:numId="28" w16cid:durableId="542329548">
-    <w:abstractNumId w:val="22"/>
+    <w:abstractNumId w:val="25"/>
     <w:lvlOverride w:ilvl="0">
       <w:startOverride w:val="4"/>
     </w:lvlOverride>
   </w:num>
   <w:num w:numId="29" w16cid:durableId="930814933">
-    <w:abstractNumId w:val="22"/>
+    <w:abstractNumId w:val="25"/>
     <w:lvlOverride w:ilvl="0">
       <w:startOverride w:val="5"/>
     </w:lvlOverride>
   </w:num>
   <w:num w:numId="30" w16cid:durableId="1051264894">
-    <w:abstractNumId w:val="13"/>
+    <w:abstractNumId w:val="15"/>
     <w:lvlOverride w:ilvl="0">
       <w:startOverride w:val="1"/>
     </w:lvlOverride>
   </w:num>
   <w:num w:numId="31" w16cid:durableId="343629943">
-    <w:abstractNumId w:val="13"/>
+    <w:abstractNumId w:val="15"/>
     <w:lvlOverride w:ilvl="0">
       <w:startOverride w:val="2"/>
     </w:lvlOverride>
   </w:num>
   <w:num w:numId="32" w16cid:durableId="2081557622">
-    <w:abstractNumId w:val="13"/>
+    <w:abstractNumId w:val="15"/>
     <w:lvlOverride w:ilvl="0">
       <w:startOverride w:val="3"/>
     </w:lvlOverride>
   </w:num>
   <w:num w:numId="33" w16cid:durableId="799685606">
-    <w:abstractNumId w:val="5"/>
+    <w:abstractNumId w:val="7"/>
   </w:num>
   <w:num w:numId="34" w16cid:durableId="1802453071">
-    <w:abstractNumId w:val="7"/>
+    <w:abstractNumId w:val="9"/>
   </w:num>
   <w:num w:numId="35" w16cid:durableId="47338310">
-    <w:abstractNumId w:val="21"/>
+    <w:abstractNumId w:val="24"/>
   </w:num>
   <w:num w:numId="36" w16cid:durableId="597910566">
-    <w:abstractNumId w:val="24"/>
+    <w:abstractNumId w:val="28"/>
   </w:num>
   <w:num w:numId="37" w16cid:durableId="1652364335">
-    <w:abstractNumId w:val="19"/>
+    <w:abstractNumId w:val="22"/>
   </w:num>
   <w:num w:numId="38" w16cid:durableId="605622125">
     <w:abstractNumId w:val="1"/>
   </w:num>
   <w:num w:numId="39" w16cid:durableId="1963921096">
-    <w:abstractNumId w:val="23"/>
+    <w:abstractNumId w:val="27"/>
   </w:num>
   <w:num w:numId="40" w16cid:durableId="1402413017">
-    <w:abstractNumId w:val="15"/>
+    <w:abstractNumId w:val="17"/>
   </w:num>
   <w:num w:numId="41" w16cid:durableId="64256231">
     <w:abstractNumId w:val="2"/>
   </w:num>
   <w:num w:numId="42" w16cid:durableId="1268737197">
-    <w:abstractNumId w:val="17"/>
+    <w:abstractNumId w:val="20"/>
   </w:num>
   <w:num w:numId="43" w16cid:durableId="1614165806">
-    <w:abstractNumId w:val="8"/>
+    <w:abstractNumId w:val="10"/>
+  </w:num>
+  <w:num w:numId="44" w16cid:durableId="621158233">
+    <w:abstractNumId w:val="6"/>
+  </w:num>
+  <w:num w:numId="45" w16cid:durableId="111479702">
+    <w:abstractNumId w:val="18"/>
+  </w:num>
+  <w:num w:numId="46" w16cid:durableId="2110353000">
+    <w:abstractNumId w:val="5"/>
+  </w:num>
+  <w:num w:numId="47" w16cid:durableId="570818591">
+    <w:abstractNumId w:val="26"/>
   </w:num>
 </w:numbering>
 </file>

</xml_diff>